<commit_message>
Update report to revised template with AI disclosure
</commit_message>
<xml_diff>
--- a/delivery/PROG2002 A2 Report.docx
+++ b/delivery/PROG2002 A2 Report.docx
@@ -1,6 +1,6 @@
 
 <file path=word/document.xml><?xml version="1.0" encoding="utf-8"?>
-<w:document xmlns:wpc="http://schemas.microsoft.com/office/word/2010/wordprocessingCanvas" xmlns:cx="http://schemas.microsoft.com/office/drawing/2014/chartex" xmlns:cx1="http://schemas.microsoft.com/office/drawing/2015/9/8/chartex" xmlns:cx2="http://schemas.microsoft.com/office/drawing/2015/10/21/chartex" xmlns:cx3="http://schemas.microsoft.com/office/drawing/2016/5/9/chartex" xmlns:cx4="http://schemas.microsoft.com/office/drawing/2016/5/10/chartex" xmlns:cx5="http://schemas.microsoft.com/office/drawing/2016/5/11/chartex" xmlns:cx6="http://schemas.microsoft.com/office/drawing/2016/5/12/chartex" xmlns:cx7="http://schemas.microsoft.com/office/drawing/2016/5/13/chartex" xmlns:cx8="http://schemas.microsoft.com/office/drawing/2016/5/14/chartex" xmlns:mc="http://schemas.openxmlformats.org/markup-compatibility/2006" xmlns:aink="http://schemas.microsoft.com/office/drawing/2016/ink" xmlns:am3d="http://schemas.microsoft.com/office/drawing/2017/model3d" xmlns:o="urn:schemas-microsoft-com:office:office" xmlns:oel="http://schemas.microsoft.com/office/2019/extlst" xmlns:r="http://schemas.openxmlformats.org/officeDocument/2006/relationships" xmlns:m="http://schemas.openxmlformats.org/officeDocument/2006/math" xmlns:v="urn:schemas-microsoft-com:vml" xmlns:wp14="http://schemas.microsoft.com/office/word/2010/wordprocessingDrawing" xmlns:wp="http://schemas.openxmlformats.org/drawingml/2006/wordprocessingDrawing" xmlns:w10="urn:schemas-microsoft-com:office:word" xmlns:w="http://schemas.openxmlformats.org/wordprocessingml/2006/main" xmlns:w14="http://schemas.microsoft.com/office/word/2010/wordml" xmlns:w15="http://schemas.microsoft.com/office/word/2012/wordml" xmlns:w16cex="http://schemas.microsoft.com/office/word/2018/wordml/cex" xmlns:w16cid="http://schemas.microsoft.com/office/word/2016/wordml/cid" xmlns:w16="http://schemas.microsoft.com/office/word/2018/wordml" xmlns:w16du="http://schemas.microsoft.com/office/word/2023/wordml/word16du" xmlns:w16sdtdh="http://schemas.microsoft.com/office/word/2020/wordml/sdtdatahash" xmlns:w16sdtfl="http://schemas.microsoft.com/office/word/2024/wordml/sdtformatlock" xmlns:w16se="http://schemas.microsoft.com/office/word/2015/wordml/symex" xmlns:wpg="http://schemas.microsoft.com/office/word/2010/wordprocessingGroup" xmlns:wpi="http://schemas.microsoft.com/office/word/2010/wordprocessingInk" xmlns:wne="http://schemas.microsoft.com/office/word/2006/wordml" xmlns:wps="http://schemas.microsoft.com/office/word/2010/wordprocessingShape" mc:Ignorable="w14 w15 w16se w16cid w16 w16cex w16sdtdh w16sdtfl w16du wp14">
+<w:document xmlns:wpc="http://schemas.microsoft.com/office/word/2010/wordprocessingCanvas" xmlns:cx="http://schemas.microsoft.com/office/drawing/2014/chartex" xmlns:cx1="http://schemas.microsoft.com/office/drawing/2015/9/8/chartex" xmlns:cx2="http://schemas.microsoft.com/office/drawing/2015/10/21/chartex" xmlns:cx3="http://schemas.microsoft.com/office/drawing/2016/5/9/chartex" xmlns:cx4="http://schemas.microsoft.com/office/drawing/2016/5/10/chartex" xmlns:cx5="http://schemas.microsoft.com/office/drawing/2016/5/11/chartex" xmlns:cx6="http://schemas.microsoft.com/office/drawing/2016/5/12/chartex" xmlns:cx7="http://schemas.microsoft.com/office/drawing/2016/5/13/chartex" xmlns:cx8="http://schemas.microsoft.com/office/drawing/2016/5/14/chartex" xmlns:mc="http://schemas.openxmlformats.org/markup-compatibility/2006" xmlns:aink="http://schemas.microsoft.com/office/drawing/2016/ink" xmlns:am3d="http://schemas.microsoft.com/office/drawing/2017/model3d" xmlns:o="urn:schemas-microsoft-com:office:office" xmlns:oel="http://schemas.microsoft.com/office/2019/extlst" xmlns:r="http://schemas.openxmlformats.org/officeDocument/2006/relationships" xmlns:m="http://schemas.openxmlformats.org/officeDocument/2006/math" xmlns:v="urn:schemas-microsoft-com:vml" xmlns:wp14="http://schemas.microsoft.com/office/word/2010/wordprocessingDrawing" xmlns:wp="http://schemas.openxmlformats.org/drawingml/2006/wordprocessingDrawing" xmlns:w10="urn:schemas-microsoft-com:office:word" xmlns:w="http://schemas.openxmlformats.org/wordprocessingml/2006/main" xmlns:w14="http://schemas.microsoft.com/office/word/2010/wordml" xmlns:w15="http://schemas.microsoft.com/office/word/2012/wordml" xmlns:w16cex="http://schemas.microsoft.com/office/word/2018/wordml/cex" xmlns:w16cid="http://schemas.microsoft.com/office/word/2016/wordml/cid" xmlns:w16="http://schemas.microsoft.com/office/word/2018/wordml" xmlns:w16sdtdh="http://schemas.microsoft.com/office/word/2020/wordml/sdtdatahash" xmlns:w16se="http://schemas.microsoft.com/office/word/2015/wordml/symex" xmlns:wpg="http://schemas.microsoft.com/office/word/2010/wordprocessingGroup" xmlns:wpi="http://schemas.microsoft.com/office/word/2010/wordprocessingInk" xmlns:wne="http://schemas.microsoft.com/office/word/2006/wordml" xmlns:wps="http://schemas.microsoft.com/office/word/2010/wordprocessingShape" mc:Ignorable="w14 w15 w16se w16cid w16 w16cex w16sdtdh wp14">
   <w:body>
     <w:p>
       <w:pPr>
@@ -659,16 +659,7 @@
           <w:sz w:val="24"/>
           <w:szCs w:val="24"/>
         </w:rPr>
-        <w:t>API design</w:t>
-      </w:r>
-      <w:r>
-        <w:rPr>
-          <w:rFonts w:ascii="Arial" w:hAnsi="Arial" w:cs="Arial"/>
-          <w:b/>
-          <w:sz w:val="24"/>
-          <w:szCs w:val="24"/>
-        </w:rPr>
-        <w:t xml:space="preserve"> </w:t>
+        <w:t xml:space="preserve">API design </w:t>
       </w:r>
     </w:p>
     <w:p>
@@ -694,7 +685,21 @@
         <w:rPr>
           <w:rStyle w:val="selected"/>
         </w:rPr>
-        <w:t>GET /api/users</w:t>
+        <w:t>GET /</w:t>
+      </w:r>
+      <w:proofErr w:type="spellStart"/>
+      <w:r>
+        <w:rPr>
+          <w:rStyle w:val="selected"/>
+        </w:rPr>
+        <w:t>api</w:t>
+      </w:r>
+      <w:proofErr w:type="spellEnd"/>
+      <w:r>
+        <w:rPr>
+          <w:rStyle w:val="selected"/>
+        </w:rPr>
+        <w:t>/users</w:t>
       </w:r>
       <w:r>
         <w:rPr>
@@ -706,7 +711,21 @@
         <w:rPr>
           <w:rStyle w:val="selected"/>
         </w:rPr>
-        <w:t>POST /api/posts</w:t>
+        <w:t>POST /</w:t>
+      </w:r>
+      <w:proofErr w:type="spellStart"/>
+      <w:r>
+        <w:rPr>
+          <w:rStyle w:val="selected"/>
+        </w:rPr>
+        <w:t>api</w:t>
+      </w:r>
+      <w:proofErr w:type="spellEnd"/>
+      <w:r>
+        <w:rPr>
+          <w:rStyle w:val="selected"/>
+        </w:rPr>
+        <w:t>/posts</w:t>
       </w:r>
       <w:r>
         <w:rPr>
@@ -868,10 +887,54 @@
         <w:spacing w:after="120" w:line="360" w:lineRule="auto"/>
         <w:ind w:left="-6" w:hanging="11"/>
         <w:rPr>
-          <w:rFonts w:ascii="Arial" w:hAnsi="Arial" w:cs="Arial"/>
-          <w:bCs/>
-          <w:sz w:val="24"/>
-          <w:szCs w:val="24"/>
+          <w:rStyle w:val="selected"/>
+        </w:rPr>
+      </w:pPr>
+    </w:p>
+    <w:p>
+      <w:pPr>
+        <w:spacing w:after="120" w:line="360" w:lineRule="auto"/>
+        <w:ind w:left="-6" w:hanging="11"/>
+        <w:rPr>
+          <w:rStyle w:val="selected"/>
+        </w:rPr>
+      </w:pPr>
+    </w:p>
+    <w:p>
+      <w:pPr>
+        <w:spacing w:after="120" w:line="360" w:lineRule="auto"/>
+        <w:ind w:left="0" w:firstLine="0"/>
+        <w:rPr>
+          <w:rFonts w:ascii="Arial" w:hAnsi="Arial" w:cs="Arial"/>
+          <w:b/>
+          <w:sz w:val="24"/>
+          <w:szCs w:val="24"/>
+        </w:rPr>
+        <w:keepNext/>
+        <w:pageBreakBefore/>
+      </w:pPr>
+      <w:r>
+        <w:rPr>
+          <w:rFonts w:ascii="Arial" w:hAnsi="Arial" w:cs="Arial"/>
+          <w:b/>
+          <w:sz w:val="24"/>
+          <w:szCs w:val="24"/>
+        </w:rPr>
+        <w:lastRenderedPageBreak/>
+        <w:t>Gen AI acknowledgement and Chat Log</w:t>
+      </w:r>
+    </w:p>
+    <w:p>
+      <w:pPr>
+        <w:pStyle w:val="ListParagraph"/>
+        <w:numPr>
+          <w:ilvl w:val="0"/>
+          <w:numId w:val="2"/>
+        </w:numPr>
+        <w:spacing w:after="120" w:line="360" w:lineRule="auto"/>
+        <w:rPr>
+          <w:rFonts w:ascii="Arial" w:hAnsi="Arial" w:cs="Arial"/>
+          <w:bCs/>
         </w:rPr>
       </w:pPr>
       <w:r>
@@ -879,17 +942,46 @@
           <w:rFonts w:ascii="Arial" w:hAnsi="Arial"/>
           <w:sz w:val="24"/>
         </w:rPr>
-        <w:t xml:space="preserve">Development note: AI assistance was used to draft and review code, tests, prose and the demo script. Student identity fields remain blank for completion before submission, and the demonstration must be recorded personally. The assessment brief's GenAI Use Level field is blank; this note does not assert course approval.</w:t>
-      </w:r>
-    </w:p>
-    <w:p>
-      <w:pPr>
-        <w:spacing w:after="120" w:line="360" w:lineRule="auto"/>
-        <w:ind w:left="-6" w:hanging="11"/>
-        <w:rPr>
-          <w:rStyle w:val="selected"/>
-        </w:rPr>
-      </w:pPr>
+        <w:t xml:space="preserve">I acknowledge that I have used GenAI tools to complete this assessment. I used OpenAI Codex to analyse the assessment requirements, generate and revise the database scripts, backend and frontend code, develop and review tests, draft and revise this report, and prepare the bilingual demonstration script. The assistance included substantial code and written-content generation, not only language correction.</w:t>
+      </w:r>
+    </w:p>
+    <w:p>
+      <w:pPr>
+        <w:spacing w:after="120" w:line="360" w:lineRule="auto"/>
+        <w:ind w:left="-6" w:hanging="11"/>
+        <w:rPr>
+          <w:rFonts w:ascii="Arial" w:hAnsi="Arial" w:cs="Arial"/>
+          <w:bCs/>
+          <w:sz w:val="24"/>
+          <w:szCs w:val="24"/>
+        </w:rPr>
+      </w:pPr>
+      <w:r>
+        <w:rPr>
+          <w:rFonts w:ascii="Arial" w:hAnsi="Arial"/>
+          <w:sz w:val="24"/>
+        </w:rPr>
+        <w:t xml:space="preserve">Scope of permission: the supplied Assessment Brief leaves the GenAI Use Level field blank, and no separate permitted-use rules have been supplied in this project conversation. This disclosure therefore does not confirm that every use listed above falls within the Unit Assessor's permitted scope. That scope must be checked before submission.</w:t>
+      </w:r>
+    </w:p>
+    <w:p>
+      <w:pPr>
+        <w:spacing w:after="120" w:line="360" w:lineRule="auto"/>
+        <w:ind w:left="-6" w:hanging="11"/>
+        <w:rPr>
+          <w:rFonts w:ascii="Arial" w:hAnsi="Arial" w:cs="Arial"/>
+          <w:bCs/>
+          <w:sz w:val="24"/>
+          <w:szCs w:val="24"/>
+        </w:rPr>
+      </w:pPr>
+      <w:r>
+        <w:rPr>
+          <w:rFonts w:ascii="Arial" w:hAnsi="Arial"/>
+          <w:sz w:val="24"/>
+        </w:rPr>
+        <w:t xml:space="preserve">Chat log summary (not a verbatim transcript): the conversation covered analysing the brief and report template; building the charity events website; testing the API, database and browser workflows; preparing the report, source ZIPs and demonstration script; uploading the project to GitHub; and updating the report to this new template. This summary does not replace the original conversation if the Unit Assessor requires a complete chat log.</w:t>
+      </w:r>
     </w:p>
     <w:p>
       <w:pPr>
@@ -911,7 +1003,7 @@
 </file>
 
 <file path=word/numbering.xml><?xml version="1.0" encoding="utf-8"?>
-<w:numbering xmlns:wpc="http://schemas.microsoft.com/office/word/2010/wordprocessingCanvas" xmlns:cx="http://schemas.microsoft.com/office/drawing/2014/chartex" xmlns:cx1="http://schemas.microsoft.com/office/drawing/2015/9/8/chartex" xmlns:cx2="http://schemas.microsoft.com/office/drawing/2015/10/21/chartex" xmlns:cx3="http://schemas.microsoft.com/office/drawing/2016/5/9/chartex" xmlns:cx4="http://schemas.microsoft.com/office/drawing/2016/5/10/chartex" xmlns:cx5="http://schemas.microsoft.com/office/drawing/2016/5/11/chartex" xmlns:cx6="http://schemas.microsoft.com/office/drawing/2016/5/12/chartex" xmlns:cx7="http://schemas.microsoft.com/office/drawing/2016/5/13/chartex" xmlns:cx8="http://schemas.microsoft.com/office/drawing/2016/5/14/chartex" xmlns:mc="http://schemas.openxmlformats.org/markup-compatibility/2006" xmlns:aink="http://schemas.microsoft.com/office/drawing/2016/ink" xmlns:am3d="http://schemas.microsoft.com/office/drawing/2017/model3d" xmlns:o="urn:schemas-microsoft-com:office:office" xmlns:oel="http://schemas.microsoft.com/office/2019/extlst" xmlns:r="http://schemas.openxmlformats.org/officeDocument/2006/relationships" xmlns:m="http://schemas.openxmlformats.org/officeDocument/2006/math" xmlns:v="urn:schemas-microsoft-com:vml" xmlns:wp14="http://schemas.microsoft.com/office/word/2010/wordprocessingDrawing" xmlns:wp="http://schemas.openxmlformats.org/drawingml/2006/wordprocessingDrawing" xmlns:w10="urn:schemas-microsoft-com:office:word" xmlns:w="http://schemas.openxmlformats.org/wordprocessingml/2006/main" xmlns:w14="http://schemas.microsoft.com/office/word/2010/wordml" xmlns:w15="http://schemas.microsoft.com/office/word/2012/wordml" xmlns:w16cex="http://schemas.microsoft.com/office/word/2018/wordml/cex" xmlns:w16cid="http://schemas.microsoft.com/office/word/2016/wordml/cid" xmlns:w16="http://schemas.microsoft.com/office/word/2018/wordml" xmlns:w16du="http://schemas.microsoft.com/office/word/2023/wordml/word16du" xmlns:w16sdtdh="http://schemas.microsoft.com/office/word/2020/wordml/sdtdatahash" xmlns:w16sdtfl="http://schemas.microsoft.com/office/word/2024/wordml/sdtformatlock" xmlns:w16se="http://schemas.microsoft.com/office/word/2015/wordml/symex" xmlns:wpg="http://schemas.microsoft.com/office/word/2010/wordprocessingGroup" xmlns:wpi="http://schemas.microsoft.com/office/word/2010/wordprocessingInk" xmlns:wne="http://schemas.microsoft.com/office/word/2006/wordml" xmlns:wps="http://schemas.microsoft.com/office/word/2010/wordprocessingShape" mc:Ignorable="w14 w15 w16se w16cid w16 w16cex w16sdtdh w16sdtfl w16du wp14">
+<w:numbering xmlns:wpc="http://schemas.microsoft.com/office/word/2010/wordprocessingCanvas" xmlns:cx="http://schemas.microsoft.com/office/drawing/2014/chartex" xmlns:cx1="http://schemas.microsoft.com/office/drawing/2015/9/8/chartex" xmlns:cx2="http://schemas.microsoft.com/office/drawing/2015/10/21/chartex" xmlns:cx3="http://schemas.microsoft.com/office/drawing/2016/5/9/chartex" xmlns:cx4="http://schemas.microsoft.com/office/drawing/2016/5/10/chartex" xmlns:cx5="http://schemas.microsoft.com/office/drawing/2016/5/11/chartex" xmlns:cx6="http://schemas.microsoft.com/office/drawing/2016/5/12/chartex" xmlns:cx7="http://schemas.microsoft.com/office/drawing/2016/5/13/chartex" xmlns:cx8="http://schemas.microsoft.com/office/drawing/2016/5/14/chartex" xmlns:mc="http://schemas.openxmlformats.org/markup-compatibility/2006" xmlns:aink="http://schemas.microsoft.com/office/drawing/2016/ink" xmlns:am3d="http://schemas.microsoft.com/office/drawing/2017/model3d" xmlns:o="urn:schemas-microsoft-com:office:office" xmlns:oel="http://schemas.microsoft.com/office/2019/extlst" xmlns:r="http://schemas.openxmlformats.org/officeDocument/2006/relationships" xmlns:m="http://schemas.openxmlformats.org/officeDocument/2006/math" xmlns:v="urn:schemas-microsoft-com:vml" xmlns:wp14="http://schemas.microsoft.com/office/word/2010/wordprocessingDrawing" xmlns:wp="http://schemas.openxmlformats.org/drawingml/2006/wordprocessingDrawing" xmlns:w10="urn:schemas-microsoft-com:office:word" xmlns:w="http://schemas.openxmlformats.org/wordprocessingml/2006/main" xmlns:w14="http://schemas.microsoft.com/office/word/2010/wordml" xmlns:w15="http://schemas.microsoft.com/office/word/2012/wordml" xmlns:w16cex="http://schemas.microsoft.com/office/word/2018/wordml/cex" xmlns:w16cid="http://schemas.microsoft.com/office/word/2016/wordml/cid" xmlns:w16="http://schemas.microsoft.com/office/word/2018/wordml" xmlns:w16sdtdh="http://schemas.microsoft.com/office/word/2020/wordml/sdtdatahash" xmlns:w16se="http://schemas.microsoft.com/office/word/2015/wordml/symex" xmlns:wpg="http://schemas.microsoft.com/office/word/2010/wordprocessingGroup" xmlns:wpi="http://schemas.microsoft.com/office/word/2010/wordprocessingInk" xmlns:wne="http://schemas.microsoft.com/office/word/2006/wordml" xmlns:wps="http://schemas.microsoft.com/office/word/2010/wordprocessingShape" mc:Ignorable="w14 w15 w16se w16cid w16 w16cex w16sdtdh wp14">
   <w:abstractNum w:abstractNumId="0" w15:restartNumberingAfterBreak="0">
     <w:nsid w:val="37A576E2"/>
     <w:multiLevelType w:val="hybridMultilevel"/>
@@ -1025,14 +1117,106 @@
       </w:rPr>
     </w:lvl>
   </w:abstractNum>
+  <w:abstractNum w:abstractNumId="1" w15:restartNumberingAfterBreak="0">
+    <w:nsid w:val="59183AFE"/>
+    <w:multiLevelType w:val="hybridMultilevel"/>
+    <w:tmpl w:val="75E0898E"/>
+    <w:lvl w:ilvl="0" w:tplc="0409000F">
+      <w:start w:val="1"/>
+      <w:numFmt w:val="decimal"/>
+      <w:lvlText w:val="%1."/>
+      <w:lvlJc w:val="left"/>
+      <w:pPr>
+        <w:ind w:left="720" w:hanging="360"/>
+      </w:pPr>
+      <w:rPr>
+        <w:rFonts w:hint="default"/>
+      </w:rPr>
+    </w:lvl>
+    <w:lvl w:ilvl="1" w:tplc="04090019" w:tentative="1">
+      <w:start w:val="1"/>
+      <w:numFmt w:val="lowerLetter"/>
+      <w:lvlText w:val="%2."/>
+      <w:lvlJc w:val="left"/>
+      <w:pPr>
+        <w:ind w:left="1440" w:hanging="360"/>
+      </w:pPr>
+    </w:lvl>
+    <w:lvl w:ilvl="2" w:tplc="0409001B" w:tentative="1">
+      <w:start w:val="1"/>
+      <w:numFmt w:val="lowerRoman"/>
+      <w:lvlText w:val="%3."/>
+      <w:lvlJc w:val="right"/>
+      <w:pPr>
+        <w:ind w:left="2160" w:hanging="180"/>
+      </w:pPr>
+    </w:lvl>
+    <w:lvl w:ilvl="3" w:tplc="0409000F" w:tentative="1">
+      <w:start w:val="1"/>
+      <w:numFmt w:val="decimal"/>
+      <w:lvlText w:val="%4."/>
+      <w:lvlJc w:val="left"/>
+      <w:pPr>
+        <w:ind w:left="2880" w:hanging="360"/>
+      </w:pPr>
+    </w:lvl>
+    <w:lvl w:ilvl="4" w:tplc="04090019" w:tentative="1">
+      <w:start w:val="1"/>
+      <w:numFmt w:val="lowerLetter"/>
+      <w:lvlText w:val="%5."/>
+      <w:lvlJc w:val="left"/>
+      <w:pPr>
+        <w:ind w:left="3600" w:hanging="360"/>
+      </w:pPr>
+    </w:lvl>
+    <w:lvl w:ilvl="5" w:tplc="0409001B" w:tentative="1">
+      <w:start w:val="1"/>
+      <w:numFmt w:val="lowerRoman"/>
+      <w:lvlText w:val="%6."/>
+      <w:lvlJc w:val="right"/>
+      <w:pPr>
+        <w:ind w:left="4320" w:hanging="180"/>
+      </w:pPr>
+    </w:lvl>
+    <w:lvl w:ilvl="6" w:tplc="0409000F" w:tentative="1">
+      <w:start w:val="1"/>
+      <w:numFmt w:val="decimal"/>
+      <w:lvlText w:val="%7."/>
+      <w:lvlJc w:val="left"/>
+      <w:pPr>
+        <w:ind w:left="5040" w:hanging="360"/>
+      </w:pPr>
+    </w:lvl>
+    <w:lvl w:ilvl="7" w:tplc="04090019" w:tentative="1">
+      <w:start w:val="1"/>
+      <w:numFmt w:val="lowerLetter"/>
+      <w:lvlText w:val="%8."/>
+      <w:lvlJc w:val="left"/>
+      <w:pPr>
+        <w:ind w:left="5760" w:hanging="360"/>
+      </w:pPr>
+    </w:lvl>
+    <w:lvl w:ilvl="8" w:tplc="0409001B" w:tentative="1">
+      <w:start w:val="1"/>
+      <w:numFmt w:val="lowerRoman"/>
+      <w:lvlText w:val="%9."/>
+      <w:lvlJc w:val="right"/>
+      <w:pPr>
+        <w:ind w:left="6480" w:hanging="180"/>
+      </w:pPr>
+    </w:lvl>
+  </w:abstractNum>
   <w:num w:numId="1" w16cid:durableId="1139109609">
     <w:abstractNumId w:val="0"/>
+  </w:num>
+  <w:num w:numId="2" w16cid:durableId="52892197">
+    <w:abstractNumId w:val="1"/>
   </w:num>
 </w:numbering>
 </file>
 
 <file path=word/styles.xml><?xml version="1.0" encoding="utf-8"?>
-<w:styles xmlns:mc="http://schemas.openxmlformats.org/markup-compatibility/2006" xmlns:r="http://schemas.openxmlformats.org/officeDocument/2006/relationships" xmlns:w="http://schemas.openxmlformats.org/wordprocessingml/2006/main" xmlns:w14="http://schemas.microsoft.com/office/word/2010/wordml" xmlns:w15="http://schemas.microsoft.com/office/word/2012/wordml" xmlns:w16cex="http://schemas.microsoft.com/office/word/2018/wordml/cex" xmlns:w16cid="http://schemas.microsoft.com/office/word/2016/wordml/cid" xmlns:w16="http://schemas.microsoft.com/office/word/2018/wordml" xmlns:w16du="http://schemas.microsoft.com/office/word/2023/wordml/word16du" xmlns:w16sdtdh="http://schemas.microsoft.com/office/word/2020/wordml/sdtdatahash" xmlns:w16sdtfl="http://schemas.microsoft.com/office/word/2024/wordml/sdtformatlock" xmlns:w16se="http://schemas.microsoft.com/office/word/2015/wordml/symex" mc:Ignorable="w14 w15 w16se w16cid w16 w16cex w16sdtdh w16sdtfl w16du">
+<w:styles xmlns:mc="http://schemas.openxmlformats.org/markup-compatibility/2006" xmlns:r="http://schemas.openxmlformats.org/officeDocument/2006/relationships" xmlns:w="http://schemas.openxmlformats.org/wordprocessingml/2006/main" xmlns:w14="http://schemas.microsoft.com/office/word/2010/wordml" xmlns:w15="http://schemas.microsoft.com/office/word/2012/wordml" xmlns:w16cex="http://schemas.microsoft.com/office/word/2018/wordml/cex" xmlns:w16cid="http://schemas.microsoft.com/office/word/2016/wordml/cid" xmlns:w16="http://schemas.microsoft.com/office/word/2018/wordml" xmlns:w16sdtdh="http://schemas.microsoft.com/office/word/2020/wordml/sdtdatahash" xmlns:w16se="http://schemas.microsoft.com/office/word/2015/wordml/symex" mc:Ignorable="w14 w15 w16se w16cid w16 w16cex w16sdtdh">
   <w:docDefaults>
     <w:rPrDefault>
       <w:rPr>

</xml_diff>